<commit_message>
minor tweak on notes
</commit_message>
<xml_diff>
--- a/Notes_BatttleBase.docx
+++ b/Notes_BatttleBase.docx
@@ -10,6 +10,7 @@
           <w:lang w:val="en-US"/>
         </w:rPr>
       </w:pPr>
+      <w:proofErr w:type="spellStart"/>
       <w:r>
         <w:rPr>
           <w:lang w:val="en-US"/>
@@ -22,6 +23,7 @@
         </w:rPr>
         <w:t>attleBase</w:t>
       </w:r>
+      <w:proofErr w:type="spellEnd"/>
       <w:r>
         <w:rPr>
           <w:lang w:val="en-US"/>
@@ -515,7 +517,15 @@
         </w:numPr>
       </w:pPr>
       <w:r>
-        <w:t>All middleware run in order</w:t>
+        <w:t xml:space="preserve">All middleware </w:t>
+      </w:r>
+      <w:proofErr w:type="gramStart"/>
+      <w:r>
+        <w:t>run</w:t>
+      </w:r>
+      <w:proofErr w:type="gramEnd"/>
+      <w:r>
+        <w:t xml:space="preserve"> in order</w:t>
       </w:r>
     </w:p>
     <w:p>
@@ -527,8 +537,15 @@
         </w:numPr>
       </w:pPr>
       <w:r>
-        <w:t>Session creates req.session</w:t>
-      </w:r>
+        <w:t xml:space="preserve">Session creates </w:t>
+      </w:r>
+      <w:proofErr w:type="spellStart"/>
+      <w:proofErr w:type="gramStart"/>
+      <w:r>
+        <w:t>req.session</w:t>
+      </w:r>
+      <w:proofErr w:type="spellEnd"/>
+      <w:proofErr w:type="gramEnd"/>
     </w:p>
     <w:p>
       <w:pPr>
@@ -538,9 +555,24 @@
           <w:numId w:val="12"/>
         </w:numPr>
       </w:pPr>
-      <w:r>
-        <w:t>Passport.initialize()  attaches passport methods to req</w:t>
-      </w:r>
+      <w:proofErr w:type="spellStart"/>
+      <w:r>
+        <w:t>Passport.initialize</w:t>
+      </w:r>
+      <w:proofErr w:type="spellEnd"/>
+      <w:proofErr w:type="gramStart"/>
+      <w:r>
+        <w:t>()  attaches</w:t>
+      </w:r>
+      <w:proofErr w:type="gramEnd"/>
+      <w:r>
+        <w:t xml:space="preserve"> passport methods to </w:t>
+      </w:r>
+      <w:proofErr w:type="spellStart"/>
+      <w:r>
+        <w:t>req</w:t>
+      </w:r>
+      <w:proofErr w:type="spellEnd"/>
     </w:p>
     <w:p>
       <w:pPr>
@@ -551,7 +583,28 @@
         </w:numPr>
       </w:pPr>
       <w:r>
-        <w:t>Checks req.session.passport.user, but it’s indefined on first login</w:t>
+        <w:t xml:space="preserve">Checks </w:t>
+      </w:r>
+      <w:proofErr w:type="spellStart"/>
+      <w:proofErr w:type="gramStart"/>
+      <w:r>
+        <w:t>req.session</w:t>
+      </w:r>
+      <w:proofErr w:type="gramEnd"/>
+      <w:r>
+        <w:t>.passport.user</w:t>
+      </w:r>
+      <w:proofErr w:type="spellEnd"/>
+      <w:r>
+        <w:t xml:space="preserve">, but it’s </w:t>
+      </w:r>
+      <w:proofErr w:type="spellStart"/>
+      <w:r>
+        <w:t>indefined</w:t>
+      </w:r>
+      <w:proofErr w:type="spellEnd"/>
+      <w:r>
+        <w:t xml:space="preserve"> on first login</w:t>
       </w:r>
     </w:p>
     <w:p>
@@ -562,8 +615,15 @@
           <w:numId w:val="12"/>
         </w:numPr>
       </w:pPr>
-      <w:r>
-        <w:t>req.sessoin is created but is mostly empty</w:t>
+      <w:proofErr w:type="spellStart"/>
+      <w:proofErr w:type="gramStart"/>
+      <w:r>
+        <w:t>req.sessoin</w:t>
+      </w:r>
+      <w:proofErr w:type="spellEnd"/>
+      <w:proofErr w:type="gramEnd"/>
+      <w:r>
+        <w:t xml:space="preserve"> is created but is mostly empty</w:t>
       </w:r>
     </w:p>
     <w:p>
@@ -574,8 +634,13 @@
           <w:numId w:val="12"/>
         </w:numPr>
       </w:pPr>
-      <w:r>
-        <w:t>req.user is still undefined</w:t>
+      <w:proofErr w:type="spellStart"/>
+      <w:r>
+        <w:t>req.user</w:t>
+      </w:r>
+      <w:proofErr w:type="spellEnd"/>
+      <w:r>
+        <w:t xml:space="preserve"> is still undefined</w:t>
       </w:r>
     </w:p>
     <w:p>
@@ -592,12 +657,53 @@
       <w:r>
         <w:t xml:space="preserve"> </w:t>
       </w:r>
-      <w:r>
-        <w:t>passport.authenticate()` in autheRoute.js runs, it triggers `passport.use( new LocalStrategy( some code</w:t>
+      <w:proofErr w:type="spellStart"/>
+      <w:proofErr w:type="gramStart"/>
+      <w:r>
+        <w:t>passport.authenticate</w:t>
+      </w:r>
+      <w:proofErr w:type="spellEnd"/>
+      <w:r>
+        <w:t>()`</w:t>
+      </w:r>
+      <w:proofErr w:type="gramEnd"/>
+      <w:r>
+        <w:t xml:space="preserve"> in autheRoute.js runs, it triggers `</w:t>
+      </w:r>
+      <w:proofErr w:type="spellStart"/>
+      <w:proofErr w:type="gramStart"/>
+      <w:r>
+        <w:t>passport.use</w:t>
+      </w:r>
+      <w:proofErr w:type="spellEnd"/>
+      <w:r>
+        <w:t>( new</w:t>
+      </w:r>
+      <w:proofErr w:type="gramEnd"/>
+      <w:r>
+        <w:t xml:space="preserve"> </w:t>
+      </w:r>
+      <w:proofErr w:type="spellStart"/>
+      <w:proofErr w:type="gramStart"/>
+      <w:r>
+        <w:t>LocalStrategy</w:t>
+      </w:r>
+      <w:proofErr w:type="spellEnd"/>
+      <w:r>
+        <w:t>( some</w:t>
+      </w:r>
+      <w:proofErr w:type="gramEnd"/>
+      <w:r>
+        <w:t xml:space="preserve"> </w:t>
+      </w:r>
+      <w:proofErr w:type="gramStart"/>
+      <w:r>
+        <w:t>code</w:t>
       </w:r>
       <w:r>
         <w:t xml:space="preserve"> ))`</w:t>
       </w:r>
+      <w:proofErr w:type="gramEnd"/>
       <w:r>
         <w:t xml:space="preserve">, which basically </w:t>
       </w:r>
@@ -618,7 +724,15 @@
         <w:t>If successful, p</w:t>
       </w:r>
       <w:r>
-        <w:t>assport automatically calls req.login(user), passing in the user object returned from the strategy.</w:t>
+        <w:t xml:space="preserve">assport automatically calls </w:t>
+      </w:r>
+      <w:proofErr w:type="spellStart"/>
+      <w:r>
+        <w:t>req.login</w:t>
+      </w:r>
+      <w:proofErr w:type="spellEnd"/>
+      <w:r>
+        <w:t>(user), passing in the user object returned from the strategy.</w:t>
       </w:r>
     </w:p>
     <w:p>
@@ -630,11 +744,34 @@
         </w:numPr>
       </w:pPr>
       <w:r>
-        <w:t xml:space="preserve">`passport.serializeUser()` is triggered after successful authentication </w:t>
-      </w:r>
-      <w:r>
-        <w:t>which in this case, stores user.id in req.sessions.passport.user</w:t>
-      </w:r>
+        <w:t>`</w:t>
+      </w:r>
+      <w:proofErr w:type="spellStart"/>
+      <w:proofErr w:type="gramStart"/>
+      <w:r>
+        <w:t>passport.serializeUser</w:t>
+      </w:r>
+      <w:proofErr w:type="spellEnd"/>
+      <w:r>
+        <w:t>()`</w:t>
+      </w:r>
+      <w:proofErr w:type="gramEnd"/>
+      <w:r>
+        <w:t xml:space="preserve"> is triggered after successful authentication </w:t>
+      </w:r>
+      <w:r>
+        <w:t xml:space="preserve">which in this case, stores user.id in </w:t>
+      </w:r>
+      <w:proofErr w:type="spellStart"/>
+      <w:proofErr w:type="gramStart"/>
+      <w:r>
+        <w:t>req.sessions</w:t>
+      </w:r>
+      <w:proofErr w:type="gramEnd"/>
+      <w:r>
+        <w:t>.passport.user</w:t>
+      </w:r>
+      <w:proofErr w:type="spellEnd"/>
       <w:r>
         <w:t xml:space="preserve"> </w:t>
       </w:r>
@@ -648,8 +785,21 @@
         </w:numPr>
       </w:pPr>
       <w:r>
-        <w:t>The session is then saved to Postgres. This is handled by express-session + connect-pg-simple. It writes a row in your session table keyed by connect.sid</w:t>
-      </w:r>
+        <w:t>The session is then saved to Postgres. This is handled by express-session + connect-</w:t>
+      </w:r>
+      <w:proofErr w:type="spellStart"/>
+      <w:r>
+        <w:t>pg</w:t>
+      </w:r>
+      <w:proofErr w:type="spellEnd"/>
+      <w:r>
+        <w:t xml:space="preserve">-simple. It writes a row in your session table keyed by </w:t>
+      </w:r>
+      <w:proofErr w:type="spellStart"/>
+      <w:r>
+        <w:t>connect.sid</w:t>
+      </w:r>
+      <w:proofErr w:type="spellEnd"/>
     </w:p>
     <w:p>
       <w:pPr>
@@ -676,8 +826,13 @@
           <w:numId w:val="11"/>
         </w:numPr>
       </w:pPr>
-      <w:r>
-        <w:t>serializeUser runs only once at login</w:t>
+      <w:proofErr w:type="spellStart"/>
+      <w:r>
+        <w:t>serializeUser</w:t>
+      </w:r>
+      <w:proofErr w:type="spellEnd"/>
+      <w:r>
+        <w:t xml:space="preserve"> runs only once at login</w:t>
       </w:r>
     </w:p>
     <w:p>
@@ -689,7 +844,28 @@
         </w:numPr>
       </w:pPr>
       <w:r>
-        <w:t>After that, future requests reuse the session and `passport.deserializeUser()` is used to rehydrate `req.user`</w:t>
+        <w:t>After that, future requests reuse the session and `</w:t>
+      </w:r>
+      <w:proofErr w:type="spellStart"/>
+      <w:proofErr w:type="gramStart"/>
+      <w:r>
+        <w:t>passport.deserializeUser</w:t>
+      </w:r>
+      <w:proofErr w:type="spellEnd"/>
+      <w:r>
+        <w:t>()`</w:t>
+      </w:r>
+      <w:proofErr w:type="gramEnd"/>
+      <w:r>
+        <w:t xml:space="preserve"> is used to rehydrate `</w:t>
+      </w:r>
+      <w:proofErr w:type="spellStart"/>
+      <w:r>
+        <w:t>req.user</w:t>
+      </w:r>
+      <w:proofErr w:type="spellEnd"/>
+      <w:r>
+        <w:t>`</w:t>
       </w:r>
     </w:p>
     <w:p/>
@@ -723,12 +899,94 @@
           <w:bCs/>
           <w:u w:val="single"/>
         </w:rPr>
+        <w:t xml:space="preserve"> – </w:t>
+      </w:r>
+      <w:r>
+        <w:rPr>
+          <w:b/>
+          <w:bCs/>
+          <w:u w:val="single"/>
+        </w:rPr>
+        <w:t>Follow-up Request After Authentication</w:t>
+      </w:r>
+    </w:p>
+    <w:p/>
+    <w:p/>
+    <w:p>
+      <w:pPr>
+        <w:rPr>
+          <w:b/>
+          <w:bCs/>
+          <w:u w:val="single"/>
+        </w:rPr>
+      </w:pPr>
+      <w:r>
+        <w:rPr>
+          <w:b/>
+          <w:bCs/>
+          <w:u w:val="single"/>
+        </w:rPr>
+        <w:t xml:space="preserve">Case </w:t>
+      </w:r>
+      <w:r>
+        <w:rPr>
+          <w:b/>
+          <w:bCs/>
+          <w:u w:val="single"/>
+        </w:rPr>
+        <w:t>3</w:t>
+      </w:r>
+      <w:r>
+        <w:rPr>
+          <w:b/>
+          <w:bCs/>
+          <w:u w:val="single"/>
+        </w:rPr>
         <w:t xml:space="preserve"> – Unauthenticated User</w:t>
       </w:r>
     </w:p>
     <w:p>
       <w:r>
-        <w:t>When a user is unauthenticated and visits a route like “/products”, the middleware `bodyParser.json()`, `passport.initialize()`, and `passport.session()` still run but will result in:</w:t>
+        <w:t>When a user is unauthenticated and visits a route like “/products”, the middleware `</w:t>
+      </w:r>
+      <w:proofErr w:type="spellStart"/>
+      <w:r>
+        <w:t>bodyParser.json</w:t>
+      </w:r>
+      <w:proofErr w:type="spellEnd"/>
+      <w:proofErr w:type="gramStart"/>
+      <w:r>
+        <w:t>()`</w:t>
+      </w:r>
+      <w:proofErr w:type="gramEnd"/>
+      <w:r>
+        <w:t>, `</w:t>
+      </w:r>
+      <w:proofErr w:type="spellStart"/>
+      <w:proofErr w:type="gramStart"/>
+      <w:r>
+        <w:t>passport.initialize</w:t>
+      </w:r>
+      <w:proofErr w:type="spellEnd"/>
+      <w:r>
+        <w:t>()`</w:t>
+      </w:r>
+      <w:proofErr w:type="gramEnd"/>
+      <w:r>
+        <w:t>, and `</w:t>
+      </w:r>
+      <w:proofErr w:type="spellStart"/>
+      <w:proofErr w:type="gramStart"/>
+      <w:r>
+        <w:t>passport.session</w:t>
+      </w:r>
+      <w:proofErr w:type="spellEnd"/>
+      <w:r>
+        <w:t>()`</w:t>
+      </w:r>
+      <w:proofErr w:type="gramEnd"/>
+      <w:r>
+        <w:t xml:space="preserve"> still run but will result in:</w:t>
       </w:r>
     </w:p>
     <w:p>
@@ -739,8 +997,15 @@
           <w:numId w:val="10"/>
         </w:numPr>
       </w:pPr>
-      <w:r>
-        <w:t>req.session to be an empty object</w:t>
+      <w:proofErr w:type="spellStart"/>
+      <w:proofErr w:type="gramStart"/>
+      <w:r>
+        <w:t>req.session</w:t>
+      </w:r>
+      <w:proofErr w:type="spellEnd"/>
+      <w:proofErr w:type="gramEnd"/>
+      <w:r>
+        <w:t xml:space="preserve"> to be an empty object</w:t>
       </w:r>
     </w:p>
     <w:p>
@@ -751,8 +1016,18 @@
           <w:numId w:val="10"/>
         </w:numPr>
       </w:pPr>
-      <w:r>
-        <w:t>req.session.passport to be undefined</w:t>
+      <w:proofErr w:type="spellStart"/>
+      <w:proofErr w:type="gramStart"/>
+      <w:r>
+        <w:t>req.session</w:t>
+      </w:r>
+      <w:proofErr w:type="gramEnd"/>
+      <w:r>
+        <w:t>.passport</w:t>
+      </w:r>
+      <w:proofErr w:type="spellEnd"/>
+      <w:r>
+        <w:t xml:space="preserve"> to be undefined</w:t>
       </w:r>
     </w:p>
     <w:p>
@@ -763,19 +1038,37 @@
           <w:numId w:val="10"/>
         </w:numPr>
       </w:pPr>
-      <w:r>
-        <w:t>req.user to be undefined</w:t>
+      <w:proofErr w:type="spellStart"/>
+      <w:r>
+        <w:t>req.user</w:t>
+      </w:r>
+      <w:proofErr w:type="spellEnd"/>
+      <w:r>
+        <w:t xml:space="preserve"> to be undefined</w:t>
       </w:r>
     </w:p>
     <w:p>
       <w:r>
         <w:t>The session will not be stored in the database because of the `</w:t>
       </w:r>
-      <w:r>
-        <w:t>saveUninitialized: false</w:t>
-      </w:r>
-      <w:r>
-        <w:t>` setting in the session() setting.</w:t>
+      <w:proofErr w:type="spellStart"/>
+      <w:r>
+        <w:t>saveUninitialized</w:t>
+      </w:r>
+      <w:proofErr w:type="spellEnd"/>
+      <w:r>
+        <w:t>: false</w:t>
+      </w:r>
+      <w:r>
+        <w:t xml:space="preserve">` setting in the </w:t>
+      </w:r>
+      <w:proofErr w:type="gramStart"/>
+      <w:r>
+        <w:t>session(</w:t>
+      </w:r>
+      <w:proofErr w:type="gramEnd"/>
+      <w:r>
+        <w:t>) setting.</w:t>
       </w:r>
     </w:p>
     <w:p/>
@@ -792,7 +1085,15 @@
     </w:p>
     <w:p>
       <w:r>
-        <w:t>ok so how do i setup Redis so that my express server can connect to it using your code suggestion?</w:t>
+        <w:t xml:space="preserve">ok so how do </w:t>
+      </w:r>
+      <w:proofErr w:type="spellStart"/>
+      <w:r>
+        <w:t>i</w:t>
+      </w:r>
+      <w:proofErr w:type="spellEnd"/>
+      <w:r>
+        <w:t xml:space="preserve"> setup Redis so that my express server can connect to it using your code suggestion?</w:t>
       </w:r>
     </w:p>
     <w:p>
@@ -837,6 +1138,7 @@
           <w:b/>
           <w:bCs/>
         </w:rPr>
+        <w:lastRenderedPageBreak/>
         <w:t>1. Choose Your Redis Service</w:t>
       </w:r>
     </w:p>
@@ -875,7 +1177,6 @@
           <w:b/>
           <w:bCs/>
         </w:rPr>
-        <w:lastRenderedPageBreak/>
         <w:t>Use a managed Redis service</w:t>
       </w:r>
       <w:r>
@@ -937,8 +1238,17 @@
           <w:b/>
           <w:bCs/>
         </w:rPr>
-        <w:t>AWS ElastiCache</w:t>
-      </w:r>
+        <w:t xml:space="preserve">AWS </w:t>
+      </w:r>
+      <w:proofErr w:type="spellStart"/>
+      <w:r>
+        <w:rPr>
+          <w:b/>
+          <w:bCs/>
+        </w:rPr>
+        <w:t>ElastiCache</w:t>
+      </w:r>
+      <w:proofErr w:type="spellEnd"/>
       <w:r>
         <w:t xml:space="preserve">, or </w:t>
       </w:r>
@@ -1017,14 +1327,21 @@
       </w:r>
     </w:p>
     <w:p>
+      <w:proofErr w:type="spellStart"/>
       <w:r>
         <w:t>CopyEdit</w:t>
       </w:r>
-    </w:p>
-    <w:p>
-      <w:r>
-        <w:t>brew install redis</w:t>
-      </w:r>
+      <w:proofErr w:type="spellEnd"/>
+    </w:p>
+    <w:p>
+      <w:r>
+        <w:t xml:space="preserve">brew install </w:t>
+      </w:r>
+      <w:proofErr w:type="spellStart"/>
+      <w:r>
+        <w:t>redis</w:t>
+      </w:r>
+      <w:proofErr w:type="spellEnd"/>
     </w:p>
     <w:p>
       <w:pPr>
@@ -1050,18 +1367,38 @@
       </w:r>
     </w:p>
     <w:p>
+      <w:proofErr w:type="spellStart"/>
       <w:r>
         <w:t>CopyEdit</w:t>
       </w:r>
-    </w:p>
-    <w:p>
-      <w:r>
-        <w:t>sudo apt-get update</w:t>
-      </w:r>
-    </w:p>
-    <w:p>
-      <w:r>
-        <w:t>sudo apt-get install redis-server</w:t>
+      <w:proofErr w:type="spellEnd"/>
+    </w:p>
+    <w:p>
+      <w:proofErr w:type="spellStart"/>
+      <w:r>
+        <w:t>sudo</w:t>
+      </w:r>
+      <w:proofErr w:type="spellEnd"/>
+      <w:r>
+        <w:t xml:space="preserve"> apt-get update</w:t>
+      </w:r>
+    </w:p>
+    <w:p>
+      <w:proofErr w:type="spellStart"/>
+      <w:r>
+        <w:t>sudo</w:t>
+      </w:r>
+      <w:proofErr w:type="spellEnd"/>
+      <w:r>
+        <w:t xml:space="preserve"> apt-get install </w:t>
+      </w:r>
+      <w:proofErr w:type="spellStart"/>
+      <w:r>
+        <w:t>redis</w:t>
+      </w:r>
+      <w:proofErr w:type="spellEnd"/>
+      <w:r>
+        <w:t>-server</w:t>
       </w:r>
     </w:p>
     <w:p>
@@ -1129,17 +1466,25 @@
       </w:r>
     </w:p>
     <w:p>
+      <w:proofErr w:type="spellStart"/>
       <w:r>
         <w:t>CopyEdit</w:t>
       </w:r>
-    </w:p>
-    <w:p>
-      <w:r>
-        <w:t>redis-server</w:t>
-      </w:r>
-    </w:p>
-    <w:p>
-      <w:r>
+      <w:proofErr w:type="spellEnd"/>
+    </w:p>
+    <w:p>
+      <w:proofErr w:type="spellStart"/>
+      <w:r>
+        <w:t>redis</w:t>
+      </w:r>
+      <w:proofErr w:type="spellEnd"/>
+      <w:r>
+        <w:t>-server</w:t>
+      </w:r>
+    </w:p>
+    <w:p>
+      <w:r>
+        <w:lastRenderedPageBreak/>
         <w:t>By default, Redis will run on localhost:6379.</w:t>
       </w:r>
     </w:p>
@@ -1165,18 +1510,40 @@
     </w:p>
     <w:p>
       <w:r>
-        <w:lastRenderedPageBreak/>
         <w:t>bash</w:t>
       </w:r>
     </w:p>
     <w:p>
+      <w:proofErr w:type="spellStart"/>
       <w:r>
         <w:t>CopyEdit</w:t>
       </w:r>
-    </w:p>
-    <w:p>
-      <w:r>
-        <w:t>npm install redis connect-redis express-session</w:t>
+      <w:proofErr w:type="spellEnd"/>
+    </w:p>
+    <w:p>
+      <w:proofErr w:type="spellStart"/>
+      <w:r>
+        <w:t>npm</w:t>
+      </w:r>
+      <w:proofErr w:type="spellEnd"/>
+      <w:r>
+        <w:t xml:space="preserve"> install </w:t>
+      </w:r>
+      <w:proofErr w:type="spellStart"/>
+      <w:r>
+        <w:t>redis</w:t>
+      </w:r>
+      <w:proofErr w:type="spellEnd"/>
+      <w:r>
+        <w:t xml:space="preserve"> connect-</w:t>
+      </w:r>
+      <w:proofErr w:type="spellStart"/>
+      <w:r>
+        <w:t>redis</w:t>
+      </w:r>
+      <w:proofErr w:type="spellEnd"/>
+      <w:r>
+        <w:t xml:space="preserve"> express-session</w:t>
       </w:r>
     </w:p>
     <w:p>
@@ -1200,45 +1567,157 @@
       </w:r>
     </w:p>
     <w:p>
+      <w:proofErr w:type="spellStart"/>
       <w:r>
         <w:t>javascript</w:t>
       </w:r>
-    </w:p>
-    <w:p>
+      <w:proofErr w:type="spellEnd"/>
+    </w:p>
+    <w:p>
+      <w:proofErr w:type="spellStart"/>
       <w:r>
         <w:t>CopyEdit</w:t>
       </w:r>
-    </w:p>
-    <w:p>
-      <w:r>
-        <w:t>const express = require('express');</w:t>
-      </w:r>
-    </w:p>
-    <w:p>
-      <w:r>
-        <w:t>const session = require('express-session');</w:t>
-      </w:r>
-    </w:p>
-    <w:p>
-      <w:r>
-        <w:t>const RedisStore = require('connect-redis')(session);</w:t>
-      </w:r>
-    </w:p>
-    <w:p>
-      <w:r>
-        <w:t>const redis = require('redis');</w:t>
-      </w:r>
-    </w:p>
-    <w:p>
-      <w:r>
-        <w:t>require('dotenv').config();</w:t>
-      </w:r>
+      <w:proofErr w:type="spellEnd"/>
+    </w:p>
+    <w:p>
+      <w:proofErr w:type="spellStart"/>
+      <w:r>
+        <w:t>const</w:t>
+      </w:r>
+      <w:proofErr w:type="spellEnd"/>
+      <w:r>
+        <w:t xml:space="preserve"> express = require('express'</w:t>
+      </w:r>
+      <w:proofErr w:type="gramStart"/>
+      <w:r>
+        <w:t>);</w:t>
+      </w:r>
+      <w:proofErr w:type="gramEnd"/>
+    </w:p>
+    <w:p>
+      <w:proofErr w:type="spellStart"/>
+      <w:r>
+        <w:t>const</w:t>
+      </w:r>
+      <w:proofErr w:type="spellEnd"/>
+      <w:r>
+        <w:t xml:space="preserve"> session = require('</w:t>
+      </w:r>
+      <w:proofErr w:type="gramStart"/>
+      <w:r>
+        <w:t>express-session</w:t>
+      </w:r>
+      <w:proofErr w:type="gramEnd"/>
+      <w:r>
+        <w:t>'</w:t>
+      </w:r>
+      <w:proofErr w:type="gramStart"/>
+      <w:r>
+        <w:t>);</w:t>
+      </w:r>
+      <w:proofErr w:type="gramEnd"/>
+    </w:p>
+    <w:p>
+      <w:proofErr w:type="spellStart"/>
+      <w:r>
+        <w:t>const</w:t>
+      </w:r>
+      <w:proofErr w:type="spellEnd"/>
+      <w:r>
+        <w:t xml:space="preserve"> </w:t>
+      </w:r>
+      <w:proofErr w:type="spellStart"/>
+      <w:r>
+        <w:t>RedisStore</w:t>
+      </w:r>
+      <w:proofErr w:type="spellEnd"/>
+      <w:r>
+        <w:t xml:space="preserve"> = require('connect-</w:t>
+      </w:r>
+      <w:proofErr w:type="spellStart"/>
+      <w:r>
+        <w:t>redis</w:t>
+      </w:r>
+      <w:proofErr w:type="spellEnd"/>
+      <w:proofErr w:type="gramStart"/>
+      <w:r>
+        <w:t>')(</w:t>
+      </w:r>
+      <w:proofErr w:type="gramEnd"/>
+      <w:r>
+        <w:t>session</w:t>
+      </w:r>
+      <w:proofErr w:type="gramStart"/>
+      <w:r>
+        <w:t>);</w:t>
+      </w:r>
+      <w:proofErr w:type="gramEnd"/>
+    </w:p>
+    <w:p>
+      <w:proofErr w:type="spellStart"/>
+      <w:r>
+        <w:t>const</w:t>
+      </w:r>
+      <w:proofErr w:type="spellEnd"/>
+      <w:r>
+        <w:t xml:space="preserve"> </w:t>
+      </w:r>
+      <w:proofErr w:type="spellStart"/>
+      <w:r>
+        <w:t>redis</w:t>
+      </w:r>
+      <w:proofErr w:type="spellEnd"/>
+      <w:r>
+        <w:t xml:space="preserve"> = require('</w:t>
+      </w:r>
+      <w:proofErr w:type="spellStart"/>
+      <w:r>
+        <w:t>redis</w:t>
+      </w:r>
+      <w:proofErr w:type="spellEnd"/>
+      <w:r>
+        <w:t>'</w:t>
+      </w:r>
+      <w:proofErr w:type="gramStart"/>
+      <w:r>
+        <w:t>);</w:t>
+      </w:r>
+      <w:proofErr w:type="gramEnd"/>
+    </w:p>
+    <w:p>
+      <w:r>
+        <w:t>require('</w:t>
+      </w:r>
+      <w:proofErr w:type="spellStart"/>
+      <w:r>
+        <w:t>dotenv</w:t>
+      </w:r>
+      <w:proofErr w:type="spellEnd"/>
+      <w:r>
+        <w:t>').</w:t>
+      </w:r>
+      <w:proofErr w:type="gramStart"/>
+      <w:r>
+        <w:t>config();</w:t>
+      </w:r>
+      <w:proofErr w:type="gramEnd"/>
     </w:p>
     <w:p/>
     <w:p>
-      <w:r>
-        <w:t>const app = express();</w:t>
-      </w:r>
+      <w:proofErr w:type="spellStart"/>
+      <w:r>
+        <w:t>const</w:t>
+      </w:r>
+      <w:proofErr w:type="spellEnd"/>
+      <w:r>
+        <w:t xml:space="preserve"> app = </w:t>
+      </w:r>
+      <w:proofErr w:type="gramStart"/>
+      <w:r>
+        <w:t>express();</w:t>
+      </w:r>
+      <w:proofErr w:type="gramEnd"/>
     </w:p>
     <w:p/>
     <w:p>
@@ -1247,18 +1726,57 @@
       </w:r>
     </w:p>
     <w:p>
-      <w:r>
-        <w:t>const redisClient = redis.createClient({</w:t>
-      </w:r>
-    </w:p>
-    <w:p>
-      <w:r>
-        <w:t xml:space="preserve">  host: 'localhost',  // Redis host (default for local Redis is localhost)</w:t>
-      </w:r>
-    </w:p>
-    <w:p>
-      <w:r>
-        <w:t xml:space="preserve">  port: 6379,         // Redis port (default is 6379)</w:t>
+      <w:proofErr w:type="spellStart"/>
+      <w:r>
+        <w:t>const</w:t>
+      </w:r>
+      <w:proofErr w:type="spellEnd"/>
+      <w:r>
+        <w:t xml:space="preserve"> </w:t>
+      </w:r>
+      <w:proofErr w:type="spellStart"/>
+      <w:r>
+        <w:t>redisClient</w:t>
+      </w:r>
+      <w:proofErr w:type="spellEnd"/>
+      <w:r>
+        <w:t xml:space="preserve"> = </w:t>
+      </w:r>
+      <w:proofErr w:type="spellStart"/>
+      <w:proofErr w:type="gramStart"/>
+      <w:r>
+        <w:t>redis.createClient</w:t>
+      </w:r>
+      <w:proofErr w:type="spellEnd"/>
+      <w:proofErr w:type="gramEnd"/>
+      <w:r>
+        <w:t>({</w:t>
+      </w:r>
+    </w:p>
+    <w:p>
+      <w:r>
+        <w:t xml:space="preserve">  host: 'localhost</w:t>
+      </w:r>
+      <w:proofErr w:type="gramStart"/>
+      <w:r>
+        <w:t>',  /</w:t>
+      </w:r>
+      <w:proofErr w:type="gramEnd"/>
+      <w:r>
+        <w:t>/ Redis host (default for local Redis is localhost)</w:t>
+      </w:r>
+    </w:p>
+    <w:p>
+      <w:r>
+        <w:t xml:space="preserve">  port: </w:t>
+      </w:r>
+      <w:proofErr w:type="gramStart"/>
+      <w:r>
+        <w:t xml:space="preserve">6379,   </w:t>
+      </w:r>
+      <w:proofErr w:type="gramEnd"/>
+      <w:r>
+        <w:t xml:space="preserve">      // Redis port (default is 6379)</w:t>
       </w:r>
     </w:p>
     <w:p>
@@ -1268,14 +1786,32 @@
     </w:p>
     <w:p/>
     <w:p>
-      <w:r>
-        <w:t>redisClient.on('connect', () =&gt; {</w:t>
-      </w:r>
-    </w:p>
-    <w:p>
-      <w:r>
-        <w:t xml:space="preserve">  console.log('Connected to Redis');</w:t>
-      </w:r>
+      <w:proofErr w:type="spellStart"/>
+      <w:r>
+        <w:t>redisClient.on</w:t>
+      </w:r>
+      <w:proofErr w:type="spellEnd"/>
+      <w:r>
+        <w:t>('connect', () =&gt; {</w:t>
+      </w:r>
+    </w:p>
+    <w:p>
+      <w:r>
+        <w:t xml:space="preserve">  </w:t>
+      </w:r>
+      <w:proofErr w:type="gramStart"/>
+      <w:r>
+        <w:t>console.log(</w:t>
+      </w:r>
+      <w:proofErr w:type="gramEnd"/>
+      <w:r>
+        <w:t>'Connected to Redis'</w:t>
+      </w:r>
+      <w:proofErr w:type="gramStart"/>
+      <w:r>
+        <w:t>);</w:t>
+      </w:r>
+      <w:proofErr w:type="gramEnd"/>
     </w:p>
     <w:p>
       <w:r>
@@ -1284,40 +1820,113 @@
     </w:p>
     <w:p/>
     <w:p>
-      <w:r>
-        <w:t>redisClient.on('error', (err) =&gt; {</w:t>
-      </w:r>
-    </w:p>
-    <w:p>
-      <w:r>
-        <w:t xml:space="preserve">  console.error('Error connecting to Redis:', err);</w:t>
-      </w:r>
-    </w:p>
-    <w:p>
-      <w:r>
-        <w:lastRenderedPageBreak/>
+      <w:proofErr w:type="spellStart"/>
+      <w:r>
+        <w:t>redisClient.on</w:t>
+      </w:r>
+      <w:proofErr w:type="spellEnd"/>
+      <w:r>
+        <w:t>('error', (err) =&gt; {</w:t>
+      </w:r>
+    </w:p>
+    <w:p>
+      <w:r>
+        <w:t xml:space="preserve">  </w:t>
+      </w:r>
+      <w:proofErr w:type="spellStart"/>
+      <w:proofErr w:type="gramStart"/>
+      <w:r>
+        <w:t>console.error</w:t>
+      </w:r>
+      <w:proofErr w:type="spellEnd"/>
+      <w:proofErr w:type="gramEnd"/>
+      <w:r>
+        <w:t>('Error connecting to Redis:', err</w:t>
+      </w:r>
+      <w:proofErr w:type="gramStart"/>
+      <w:r>
+        <w:t>);</w:t>
+      </w:r>
+      <w:proofErr w:type="gramEnd"/>
+    </w:p>
+    <w:p>
+      <w:r>
         <w:t>});</w:t>
       </w:r>
     </w:p>
     <w:p/>
     <w:p>
-      <w:r>
-        <w:t>app.use(</w:t>
-      </w:r>
-    </w:p>
-    <w:p>
-      <w:r>
-        <w:t xml:space="preserve">  session({</w:t>
-      </w:r>
-    </w:p>
-    <w:p>
-      <w:r>
-        <w:t xml:space="preserve">    store: new RedisStore({ client: redisClient }), // Use Redis store for sessions</w:t>
-      </w:r>
-    </w:p>
-    <w:p>
-      <w:r>
-        <w:t xml:space="preserve">    secret: process.env.SESSION_SECRET,</w:t>
+      <w:proofErr w:type="spellStart"/>
+      <w:proofErr w:type="gramStart"/>
+      <w:r>
+        <w:t>app.use</w:t>
+      </w:r>
+      <w:proofErr w:type="spellEnd"/>
+      <w:r>
+        <w:t>(</w:t>
+      </w:r>
+      <w:proofErr w:type="gramEnd"/>
+    </w:p>
+    <w:p>
+      <w:r>
+        <w:t xml:space="preserve">  </w:t>
+      </w:r>
+      <w:proofErr w:type="gramStart"/>
+      <w:r>
+        <w:t>session(</w:t>
+      </w:r>
+      <w:proofErr w:type="gramEnd"/>
+      <w:r>
+        <w:t>{</w:t>
+      </w:r>
+    </w:p>
+    <w:p>
+      <w:r>
+        <w:t xml:space="preserve">    store: new </w:t>
+      </w:r>
+      <w:proofErr w:type="spellStart"/>
+      <w:proofErr w:type="gramStart"/>
+      <w:r>
+        <w:t>RedisStore</w:t>
+      </w:r>
+      <w:proofErr w:type="spellEnd"/>
+      <w:r>
+        <w:t>({ client</w:t>
+      </w:r>
+      <w:proofErr w:type="gramEnd"/>
+      <w:r>
+        <w:t xml:space="preserve">: </w:t>
+      </w:r>
+      <w:proofErr w:type="spellStart"/>
+      <w:proofErr w:type="gramStart"/>
+      <w:r>
+        <w:t>redisClient</w:t>
+      </w:r>
+      <w:proofErr w:type="spellEnd"/>
+      <w:r>
+        <w:t xml:space="preserve"> }</w:t>
+      </w:r>
+      <w:proofErr w:type="gramEnd"/>
+      <w:r>
+        <w:t>), // Use Redis store for sessions</w:t>
+      </w:r>
+    </w:p>
+    <w:p>
+      <w:r>
+        <w:t xml:space="preserve">    secret: </w:t>
+      </w:r>
+      <w:proofErr w:type="spellStart"/>
+      <w:proofErr w:type="gramStart"/>
+      <w:r>
+        <w:t>process.env.SESSION</w:t>
+      </w:r>
+      <w:proofErr w:type="gramEnd"/>
+      <w:r>
+        <w:t>_SECRET</w:t>
+      </w:r>
+      <w:proofErr w:type="spellEnd"/>
+      <w:r>
+        <w:t>,</w:t>
       </w:r>
     </w:p>
     <w:p>
@@ -1327,12 +1936,36 @@
     </w:p>
     <w:p>
       <w:r>
-        <w:t xml:space="preserve">    saveUninitialized: false,</w:t>
-      </w:r>
-    </w:p>
-    <w:p>
-      <w:r>
-        <w:t xml:space="preserve">    cookie: { secure: false }, // Set to true if you're using HTTPS in production</w:t>
+        <w:t xml:space="preserve">    </w:t>
+      </w:r>
+      <w:proofErr w:type="spellStart"/>
+      <w:r>
+        <w:t>saveUninitialized</w:t>
+      </w:r>
+      <w:proofErr w:type="spellEnd"/>
+      <w:r>
+        <w:t>: false,</w:t>
+      </w:r>
+    </w:p>
+    <w:p>
+      <w:r>
+        <w:t xml:space="preserve">    cookie: </w:t>
+      </w:r>
+      <w:proofErr w:type="gramStart"/>
+      <w:r>
+        <w:t>{ secure</w:t>
+      </w:r>
+      <w:proofErr w:type="gramEnd"/>
+      <w:r>
+        <w:t xml:space="preserve">: </w:t>
+      </w:r>
+      <w:proofErr w:type="gramStart"/>
+      <w:r>
+        <w:t>false }</w:t>
+      </w:r>
+      <w:proofErr w:type="gramEnd"/>
+      <w:r>
+        <w:t>, // Set to true if you're using HTTPS in production</w:t>
       </w:r>
     </w:p>
     <w:p>
@@ -1347,14 +1980,47 @@
     </w:p>
     <w:p/>
     <w:p>
-      <w:r>
-        <w:t>app.get('/', (req, res) =&gt; {</w:t>
-      </w:r>
-    </w:p>
-    <w:p>
-      <w:r>
-        <w:t xml:space="preserve">  res.send('Hello, Redis!');</w:t>
-      </w:r>
+      <w:proofErr w:type="spellStart"/>
+      <w:proofErr w:type="gramStart"/>
+      <w:r>
+        <w:t>app.get</w:t>
+      </w:r>
+      <w:proofErr w:type="spellEnd"/>
+      <w:r>
+        <w:t>(</w:t>
+      </w:r>
+      <w:proofErr w:type="gramEnd"/>
+      <w:r>
+        <w:t>'/', (</w:t>
+      </w:r>
+      <w:proofErr w:type="spellStart"/>
+      <w:r>
+        <w:t>req</w:t>
+      </w:r>
+      <w:proofErr w:type="spellEnd"/>
+      <w:r>
+        <w:t>, res) =&gt; {</w:t>
+      </w:r>
+    </w:p>
+    <w:p>
+      <w:r>
+        <w:t xml:space="preserve">  </w:t>
+      </w:r>
+      <w:proofErr w:type="spellStart"/>
+      <w:proofErr w:type="gramStart"/>
+      <w:r>
+        <w:t>res.send</w:t>
+      </w:r>
+      <w:proofErr w:type="spellEnd"/>
+      <w:proofErr w:type="gramEnd"/>
+      <w:r>
+        <w:t>('Hello, Redis!'</w:t>
+      </w:r>
+      <w:proofErr w:type="gramStart"/>
+      <w:r>
+        <w:t>);</w:t>
+      </w:r>
+      <w:proofErr w:type="gramEnd"/>
     </w:p>
     <w:p>
       <w:r>
@@ -1363,14 +2029,34 @@
     </w:p>
     <w:p/>
     <w:p>
-      <w:r>
-        <w:t>app.listen(4001, () =&gt; {</w:t>
-      </w:r>
-    </w:p>
-    <w:p>
-      <w:r>
-        <w:t xml:space="preserve">  console.log('Server running on http://localhost:4001');</w:t>
-      </w:r>
+      <w:proofErr w:type="spellStart"/>
+      <w:proofErr w:type="gramStart"/>
+      <w:r>
+        <w:t>app.listen</w:t>
+      </w:r>
+      <w:proofErr w:type="spellEnd"/>
+      <w:proofErr w:type="gramEnd"/>
+      <w:r>
+        <w:t>(4001, () =&gt; {</w:t>
+      </w:r>
+    </w:p>
+    <w:p>
+      <w:r>
+        <w:t xml:space="preserve">  </w:t>
+      </w:r>
+      <w:proofErr w:type="gramStart"/>
+      <w:r>
+        <w:t>console.log(</w:t>
+      </w:r>
+      <w:proofErr w:type="gramEnd"/>
+      <w:r>
+        <w:t>'Server running on http://localhost:4001'</w:t>
+      </w:r>
+      <w:proofErr w:type="gramStart"/>
+      <w:r>
+        <w:t>);</w:t>
+      </w:r>
+      <w:proofErr w:type="gramEnd"/>
     </w:p>
     <w:p>
       <w:r>
@@ -1401,7 +2087,15 @@
         </w:numPr>
       </w:pPr>
       <w:r>
-        <w:t>Sessions are stored in Redis instead of memory, using the connect-redis store.</w:t>
+        <w:t>Sessions are stored in Redis instead of memory, using the connect-</w:t>
+      </w:r>
+      <w:proofErr w:type="spellStart"/>
+      <w:r>
+        <w:t>redis</w:t>
+      </w:r>
+      <w:proofErr w:type="spellEnd"/>
+      <w:r>
+        <w:t xml:space="preserve"> store.</w:t>
       </w:r>
     </w:p>
     <w:p>
@@ -1448,8 +2142,17 @@
           <w:b/>
           <w:bCs/>
         </w:rPr>
-        <w:t>AWS ElastiCache</w:t>
-      </w:r>
+        <w:t xml:space="preserve">AWS </w:t>
+      </w:r>
+      <w:proofErr w:type="spellStart"/>
+      <w:r>
+        <w:rPr>
+          <w:b/>
+          <w:bCs/>
+        </w:rPr>
+        <w:t>ElastiCache</w:t>
+      </w:r>
+      <w:proofErr w:type="spellEnd"/>
       <w:r>
         <w:t xml:space="preserve">, or </w:t>
       </w:r>
@@ -1476,6 +2179,7 @@
           <w:b/>
           <w:bCs/>
         </w:rPr>
+        <w:lastRenderedPageBreak/>
         <w:t>Step 1: Sign Up for Redis Cloud or Managed Redis Service</w:t>
       </w:r>
     </w:p>
@@ -1494,7 +2198,15 @@
         <w:t>Redis Cloud</w:t>
       </w:r>
       <w:r>
-        <w:t xml:space="preserve"> (RedisLabs): Redis Cloud</w:t>
+        <w:t xml:space="preserve"> (</w:t>
+      </w:r>
+      <w:proofErr w:type="spellStart"/>
+      <w:r>
+        <w:t>RedisLabs</w:t>
+      </w:r>
+      <w:proofErr w:type="spellEnd"/>
+      <w:r>
+        <w:t>): Redis Cloud</w:t>
       </w:r>
     </w:p>
     <w:p>
@@ -1509,8 +2221,17 @@
           <w:b/>
           <w:bCs/>
         </w:rPr>
-        <w:t>AWS ElastiCache</w:t>
-      </w:r>
+        <w:t xml:space="preserve">AWS </w:t>
+      </w:r>
+      <w:proofErr w:type="spellStart"/>
+      <w:r>
+        <w:rPr>
+          <w:b/>
+          <w:bCs/>
+        </w:rPr>
+        <w:t>ElastiCache</w:t>
+      </w:r>
+      <w:proofErr w:type="spellEnd"/>
       <w:r>
         <w:t xml:space="preserve">: </w:t>
       </w:r>
@@ -1519,8 +2240,16 @@
           <w:rPr>
             <w:rStyle w:val="Hyperlink"/>
           </w:rPr>
-          <w:t>AWS ElastiCache</w:t>
+          <w:t xml:space="preserve">AWS </w:t>
         </w:r>
+        <w:proofErr w:type="spellStart"/>
+        <w:r>
+          <w:rPr>
+            <w:rStyle w:val="Hyperlink"/>
+          </w:rPr>
+          <w:t>ElastiCache</w:t>
+        </w:r>
+        <w:proofErr w:type="spellEnd"/>
       </w:hyperlink>
     </w:p>
     <w:p>
@@ -1535,7 +2264,6 @@
           <w:b/>
           <w:bCs/>
         </w:rPr>
-        <w:lastRenderedPageBreak/>
         <w:t>Render Redis</w:t>
       </w:r>
       <w:r>
@@ -1578,29 +2306,90 @@
       </w:r>
     </w:p>
     <w:p>
+      <w:proofErr w:type="spellStart"/>
       <w:r>
         <w:t>javascript</w:t>
       </w:r>
-    </w:p>
-    <w:p>
+      <w:proofErr w:type="spellEnd"/>
+    </w:p>
+    <w:p>
+      <w:proofErr w:type="spellStart"/>
       <w:r>
         <w:t>CopyEdit</w:t>
       </w:r>
-    </w:p>
-    <w:p>
-      <w:r>
-        <w:t>const redisClient = redis.createClient({</w:t>
-      </w:r>
-    </w:p>
-    <w:p>
-      <w:r>
-        <w:t xml:space="preserve">  url: process.env.REDIS_URL, // Use the URL from your environment variable</w:t>
-      </w:r>
-    </w:p>
-    <w:p>
-      <w:r>
-        <w:t xml:space="preserve">  legacyMode: true,            // Compatibility mode for Redis with connect-redis</w:t>
-      </w:r>
+      <w:proofErr w:type="spellEnd"/>
+    </w:p>
+    <w:p>
+      <w:proofErr w:type="spellStart"/>
+      <w:r>
+        <w:t>const</w:t>
+      </w:r>
+      <w:proofErr w:type="spellEnd"/>
+      <w:r>
+        <w:t xml:space="preserve"> </w:t>
+      </w:r>
+      <w:proofErr w:type="spellStart"/>
+      <w:r>
+        <w:t>redisClient</w:t>
+      </w:r>
+      <w:proofErr w:type="spellEnd"/>
+      <w:r>
+        <w:t xml:space="preserve"> = </w:t>
+      </w:r>
+      <w:proofErr w:type="spellStart"/>
+      <w:proofErr w:type="gramStart"/>
+      <w:r>
+        <w:t>redis.createClient</w:t>
+      </w:r>
+      <w:proofErr w:type="spellEnd"/>
+      <w:proofErr w:type="gramEnd"/>
+      <w:r>
+        <w:t>({</w:t>
+      </w:r>
+    </w:p>
+    <w:p>
+      <w:r>
+        <w:t xml:space="preserve">  url: </w:t>
+      </w:r>
+      <w:proofErr w:type="spellStart"/>
+      <w:proofErr w:type="gramStart"/>
+      <w:r>
+        <w:t>process.env.REDIS</w:t>
+      </w:r>
+      <w:proofErr w:type="gramEnd"/>
+      <w:r>
+        <w:t>_URL</w:t>
+      </w:r>
+      <w:proofErr w:type="spellEnd"/>
+      <w:r>
+        <w:t>, // Use the URL from your environment variable</w:t>
+      </w:r>
+    </w:p>
+    <w:p>
+      <w:r>
+        <w:t xml:space="preserve">  </w:t>
+      </w:r>
+      <w:proofErr w:type="spellStart"/>
+      <w:r>
+        <w:t>legacyMode</w:t>
+      </w:r>
+      <w:proofErr w:type="spellEnd"/>
+      <w:r>
+        <w:t xml:space="preserve">: </w:t>
+      </w:r>
+      <w:proofErr w:type="gramStart"/>
+      <w:r>
+        <w:t xml:space="preserve">true,   </w:t>
+      </w:r>
+      <w:proofErr w:type="gramEnd"/>
+      <w:r>
+        <w:t xml:space="preserve">         // Compatibility mode for Redis with connect-</w:t>
+      </w:r>
+      <w:proofErr w:type="spellStart"/>
+      <w:r>
+        <w:t>redis</w:t>
+      </w:r>
+      <w:proofErr w:type="spellEnd"/>
     </w:p>
     <w:p>
       <w:r>
@@ -1609,9 +2398,32 @@
     </w:p>
     <w:p/>
     <w:p>
-      <w:r>
-        <w:t>redisClient.connect().catch(console.error);</w:t>
-      </w:r>
+      <w:proofErr w:type="spellStart"/>
+      <w:r>
+        <w:t>redisClient.connect</w:t>
+      </w:r>
+      <w:proofErr w:type="spellEnd"/>
+      <w:r>
+        <w:t>(</w:t>
+      </w:r>
+      <w:proofErr w:type="gramStart"/>
+      <w:r>
+        <w:t>).catch</w:t>
+      </w:r>
+      <w:proofErr w:type="gramEnd"/>
+      <w:r>
+        <w:t>(</w:t>
+      </w:r>
+      <w:proofErr w:type="spellStart"/>
+      <w:proofErr w:type="gramStart"/>
+      <w:r>
+        <w:t>console.error</w:t>
+      </w:r>
+      <w:proofErr w:type="spellEnd"/>
+      <w:r>
+        <w:t>);</w:t>
+      </w:r>
+      <w:proofErr w:type="gramEnd"/>
     </w:p>
     <w:p>
       <w:r>
@@ -1642,9 +2454,11 @@
       </w:r>
     </w:p>
     <w:p>
+      <w:proofErr w:type="spellStart"/>
       <w:r>
         <w:t>CopyEdit</w:t>
       </w:r>
+      <w:proofErr w:type="spellEnd"/>
     </w:p>
     <w:p>
       <w:r>
@@ -1670,49 +2484,144 @@
       </w:r>
     </w:p>
     <w:p>
+      <w:proofErr w:type="spellStart"/>
       <w:r>
         <w:t>javascript</w:t>
       </w:r>
-    </w:p>
-    <w:p>
+      <w:proofErr w:type="spellEnd"/>
+    </w:p>
+    <w:p>
+      <w:proofErr w:type="spellStart"/>
       <w:r>
         <w:t>CopyEdit</w:t>
       </w:r>
-    </w:p>
-    <w:p>
-      <w:r>
-        <w:t>app.use(</w:t>
-      </w:r>
-    </w:p>
-    <w:p>
-      <w:r>
-        <w:t xml:space="preserve">  session({</w:t>
-      </w:r>
-    </w:p>
-    <w:p>
-      <w:r>
-        <w:t xml:space="preserve">    store: new RedisStore({ client: redisClient }), // Use Redis store</w:t>
-      </w:r>
-    </w:p>
-    <w:p>
-      <w:r>
-        <w:t xml:space="preserve">    secret: process.env.SESSION_SECRET,</w:t>
-      </w:r>
-    </w:p>
-    <w:p>
-      <w:r>
+      <w:proofErr w:type="spellEnd"/>
+    </w:p>
+    <w:p>
+      <w:proofErr w:type="spellStart"/>
+      <w:proofErr w:type="gramStart"/>
+      <w:r>
+        <w:t>app.use</w:t>
+      </w:r>
+      <w:proofErr w:type="spellEnd"/>
+      <w:r>
+        <w:t>(</w:t>
+      </w:r>
+      <w:proofErr w:type="gramEnd"/>
+    </w:p>
+    <w:p>
+      <w:r>
+        <w:t xml:space="preserve">  </w:t>
+      </w:r>
+      <w:proofErr w:type="gramStart"/>
+      <w:r>
+        <w:t>session(</w:t>
+      </w:r>
+      <w:proofErr w:type="gramEnd"/>
+      <w:r>
+        <w:t>{</w:t>
+      </w:r>
+    </w:p>
+    <w:p>
+      <w:r>
+        <w:t xml:space="preserve">    store: new </w:t>
+      </w:r>
+      <w:proofErr w:type="spellStart"/>
+      <w:proofErr w:type="gramStart"/>
+      <w:r>
+        <w:t>RedisStore</w:t>
+      </w:r>
+      <w:proofErr w:type="spellEnd"/>
+      <w:r>
+        <w:t>({ client</w:t>
+      </w:r>
+      <w:proofErr w:type="gramEnd"/>
+      <w:r>
+        <w:t xml:space="preserve">: </w:t>
+      </w:r>
+      <w:proofErr w:type="spellStart"/>
+      <w:proofErr w:type="gramStart"/>
+      <w:r>
+        <w:t>redisClient</w:t>
+      </w:r>
+      <w:proofErr w:type="spellEnd"/>
+      <w:r>
+        <w:t xml:space="preserve"> }</w:t>
+      </w:r>
+      <w:proofErr w:type="gramEnd"/>
+      <w:r>
+        <w:t>), // Use Redis store</w:t>
+      </w:r>
+    </w:p>
+    <w:p>
+      <w:r>
+        <w:t xml:space="preserve">    secret: </w:t>
+      </w:r>
+      <w:proofErr w:type="spellStart"/>
+      <w:proofErr w:type="gramStart"/>
+      <w:r>
+        <w:t>process.env.SESSION</w:t>
+      </w:r>
+      <w:proofErr w:type="gramEnd"/>
+      <w:r>
+        <w:t>_SECRET</w:t>
+      </w:r>
+      <w:proofErr w:type="spellEnd"/>
+      <w:r>
+        <w:t>,</w:t>
+      </w:r>
+    </w:p>
+    <w:p>
+      <w:r>
+        <w:lastRenderedPageBreak/>
         <w:t xml:space="preserve">    resave: false,</w:t>
       </w:r>
     </w:p>
     <w:p>
       <w:r>
-        <w:t xml:space="preserve">    saveUninitialized: false,</w:t>
-      </w:r>
-    </w:p>
-    <w:p>
-      <w:r>
-        <w:lastRenderedPageBreak/>
-        <w:t xml:space="preserve">    cookie: { secure: process.env.NODE_ENV === 'production' }, // Secure cookie in production</w:t>
+        <w:t xml:space="preserve">    </w:t>
+      </w:r>
+      <w:proofErr w:type="spellStart"/>
+      <w:r>
+        <w:t>saveUninitialized</w:t>
+      </w:r>
+      <w:proofErr w:type="spellEnd"/>
+      <w:r>
+        <w:t>: false,</w:t>
+      </w:r>
+    </w:p>
+    <w:p>
+      <w:r>
+        <w:t xml:space="preserve">    cookie: </w:t>
+      </w:r>
+      <w:proofErr w:type="gramStart"/>
+      <w:r>
+        <w:t>{ secure</w:t>
+      </w:r>
+      <w:proofErr w:type="gramEnd"/>
+      <w:r>
+        <w:t xml:space="preserve">: </w:t>
+      </w:r>
+      <w:proofErr w:type="spellStart"/>
+      <w:proofErr w:type="gramStart"/>
+      <w:r>
+        <w:t>process.env.NODE</w:t>
+      </w:r>
+      <w:proofErr w:type="gramEnd"/>
+      <w:r>
+        <w:t>_ENV</w:t>
+      </w:r>
+      <w:proofErr w:type="spellEnd"/>
+      <w:r>
+        <w:t xml:space="preserve"> === 'production</w:t>
+      </w:r>
+      <w:proofErr w:type="gramStart"/>
+      <w:r>
+        <w:t>' }</w:t>
+      </w:r>
+      <w:proofErr w:type="gramEnd"/>
+      <w:r>
+        <w:t>, // Secure cookie in production</w:t>
       </w:r>
     </w:p>
     <w:p>
@@ -1765,7 +2674,15 @@
         <w:t>managed Redis service</w:t>
       </w:r>
       <w:r>
-        <w:t xml:space="preserve"> like Redis Cloud, AWS ElastiCache, or Render Redis.</w:t>
+        <w:t xml:space="preserve"> like Redis Cloud, AWS </w:t>
+      </w:r>
+      <w:proofErr w:type="spellStart"/>
+      <w:r>
+        <w:t>ElastiCache</w:t>
+      </w:r>
+      <w:proofErr w:type="spellEnd"/>
+      <w:r>
+        <w:t>, or Render Redis.</w:t>
       </w:r>
     </w:p>
     <w:p>
@@ -1804,7 +2721,15 @@
         <w:t>encrypted connections</w:t>
       </w:r>
       <w:r>
-        <w:t xml:space="preserve"> (use tls/SSL if supported by your service).</w:t>
+        <w:t xml:space="preserve"> (use </w:t>
+      </w:r>
+      <w:proofErr w:type="spellStart"/>
+      <w:r>
+        <w:t>tls</w:t>
+      </w:r>
+      <w:proofErr w:type="spellEnd"/>
+      <w:r>
+        <w:t>/SSL if supported by your service).</w:t>
       </w:r>
     </w:p>
     <w:p>
@@ -1855,7 +2780,15 @@
         <w:t>Install Redis client and session store</w:t>
       </w:r>
       <w:r>
-        <w:t xml:space="preserve"> via npm.</w:t>
+        <w:t xml:space="preserve"> via </w:t>
+      </w:r>
+      <w:proofErr w:type="spellStart"/>
+      <w:r>
+        <w:t>npm</w:t>
+      </w:r>
+      <w:proofErr w:type="spellEnd"/>
+      <w:r>
+        <w:t>.</w:t>
       </w:r>
     </w:p>
     <w:p>
@@ -1873,7 +2806,15 @@
         <w:t>Connect Redis to your Express app</w:t>
       </w:r>
       <w:r>
-        <w:t xml:space="preserve"> using connect-redis for session management.</w:t>
+        <w:t xml:space="preserve"> using connect-</w:t>
+      </w:r>
+      <w:proofErr w:type="spellStart"/>
+      <w:r>
+        <w:t>redis</w:t>
+      </w:r>
+      <w:proofErr w:type="spellEnd"/>
+      <w:r>
+        <w:t xml:space="preserve"> for session management.</w:t>
       </w:r>
     </w:p>
     <w:p>
@@ -2039,7 +2980,15 @@
         </w:numPr>
       </w:pPr>
       <w:r>
-        <w:t>Secure password storage (e.g., hashing with bcrypt).</w:t>
+        <w:t xml:space="preserve">Secure password storage (e.g., hashing with </w:t>
+      </w:r>
+      <w:proofErr w:type="spellStart"/>
+      <w:r>
+        <w:t>bcrypt</w:t>
+      </w:r>
+      <w:proofErr w:type="spellEnd"/>
+      <w:r>
+        <w:t>).</w:t>
       </w:r>
     </w:p>
     <w:p>
@@ -2083,7 +3032,15 @@
       </w:r>
       <w:r>
         <w:br/>
-        <w:t>Display efficient data modeling and relationships (e.g., one-to-many for users and orders). Showcase use of indexes, normalization, and optimized queries. Show an understanding of transactions (especially for orders/payments).</w:t>
+        <w:t xml:space="preserve">Display efficient data </w:t>
+      </w:r>
+      <w:proofErr w:type="spellStart"/>
+      <w:r>
+        <w:t>modeling</w:t>
+      </w:r>
+      <w:proofErr w:type="spellEnd"/>
+      <w:r>
+        <w:t xml:space="preserve"> and relationships (e.g., one-to-many for users and orders). Showcase use of indexes, normalization, and optimized queries. Show an understanding of transactions (especially for orders/payments).</w:t>
       </w:r>
     </w:p>
     <w:p>
@@ -2127,7 +3084,15 @@
       </w:r>
       <w:r>
         <w:br/>
-        <w:t>Implement robust error handling strategies with meaningful error messages for different HTTP status codes (e.g., 404 for not found, 500 for server errors). Implement logging and monitoring (e.g., using tools like Winston, Loggly, or Datadog).</w:t>
+        <w:t xml:space="preserve">Implement robust error handling strategies with meaningful error messages for different HTTP status codes (e.g., 404 for not found, 500 for server errors). Implement logging and monitoring (e.g., using tools like Winston, </w:t>
+      </w:r>
+      <w:proofErr w:type="spellStart"/>
+      <w:r>
+        <w:t>Loggly</w:t>
+      </w:r>
+      <w:proofErr w:type="spellEnd"/>
+      <w:r>
+        <w:t>, or Datadog).</w:t>
       </w:r>
     </w:p>
     <w:p>
@@ -2257,7 +3222,21 @@
         <w:rPr>
           <w:lang w:val="en-US"/>
         </w:rPr>
-        <w:t>I created a sequence for the `users` table in my postgres database. Every time a new row is added to the table, the next value of the sequence is called using a trigger and function, where the sequence value is also used to generate the ID for the table. Is</w:t>
+        <w:t xml:space="preserve">I created a sequence for the `users` table in my </w:t>
+      </w:r>
+      <w:proofErr w:type="spellStart"/>
+      <w:r>
+        <w:rPr>
+          <w:lang w:val="en-US"/>
+        </w:rPr>
+        <w:t>postgres</w:t>
+      </w:r>
+      <w:proofErr w:type="spellEnd"/>
+      <w:r>
+        <w:rPr>
+          <w:lang w:val="en-US"/>
+        </w:rPr>
+        <w:t xml:space="preserve"> database. Every time a new row is added to the table, the next value of the sequence is called using a trigger and function, where the sequence value is also used to generate the ID for the table. Is</w:t>
       </w:r>
       <w:r>
         <w:rPr>
@@ -4494,6 +5473,7 @@
   <w:style w:type="character" w:default="1" w:styleId="DefaultParagraphFont">
     <w:name w:val="Default Paragraph Font"/>
     <w:uiPriority w:val="1"/>
+    <w:semiHidden/>
     <w:unhideWhenUsed/>
   </w:style>
   <w:style w:type="table" w:default="1" w:styleId="TableNormal">

</xml_diff>